<commit_message>
AGI 0731393-22: complementa o voto com os autos de origem
Co-Authored-By: Claude Sonnet 5.5 <noreply@anthropic.com>
Claude-Session: https://claude.ai/code/session_01TWDXEyurpxw3CLCWtfzVHa
</commit_message>
<xml_diff>
--- a/entregas-0731393-zero/10 AGI 0731393-22 Marcos NP penhora de veículo ordem legal SISBAJUD teimosinha menor onerosidade (voto do zero).docx
+++ b/entregas-0731393-zero/10 AGI 0731393-22 Marcos NP penhora de veículo ordem legal SISBAJUD teimosinha menor onerosidade (voto do zero).docx
@@ -1114,22 +1114,22 @@
           <w:i w:val="0"/>
           <w:sz w:val="28"/>
         </w:rPr>
-        <w:t>5. A preferência do dinheiro na ordem legal não impede a penhora de veículo quando as buscas anteriores por ativos financeiros foram infrutíferas, pois o juiz pode alterar a ordem conforme as circunstâncias do caso concreto (CPC 835 § 1º).</w:t>
-      </w:r>
-    </w:p>
-    <w:p>
-      <w:pPr>
-        <w:spacing w:line="360" w:lineRule="auto" w:before="0" w:after="0"/>
-        <w:jc w:val="both"/>
-      </w:pPr>
-      <w:r>
-        <w:rPr>
-          <w:rFonts w:ascii="Arial" w:hAnsi="Arial" w:cs="Arial"/>
-          <w:b w:val="0"/>
-          <w:i w:val="0"/>
-          <w:sz w:val="28"/>
-        </w:rPr>
-        <w:t>6. O decurso de menos de quatro meses entre o indeferimento da reiteração da pesquisa SISBAJUD (26/11/2025) e a penhora do veículo (23/03/2026), sem elemento concreto de alteração patrimonial, não justifica a prévia pesquisa na modalidade “teimosinha”.</w:t>
+        <w:t>5. A preferência do dinheiro na ordem legal não impede a penhora de veículo, pois o juiz pode alterar a ordem conforme as circunstâncias do caso concreto (CPC 835 § 1º).</w:t>
+      </w:r>
+    </w:p>
+    <w:p>
+      <w:pPr>
+        <w:spacing w:line="360" w:lineRule="auto" w:before="0" w:after="0"/>
+        <w:jc w:val="both"/>
+      </w:pPr>
+      <w:r>
+        <w:rPr>
+          <w:rFonts w:ascii="Arial" w:hAnsi="Arial" w:cs="Arial"/>
+          <w:b w:val="0"/>
+          <w:i w:val="0"/>
+          <w:sz w:val="28"/>
+        </w:rPr>
+        <w:t>6. A última pesquisa SISBAJUD, infrutífera, foi certificada em 01/02/2023, e a reiteração pedida pela credora foi indeferida em 26/11/2025 em decisão estranha a este recurso; a renovação da pesquisa não é condição para a penhora do veículo.</w:t>
       </w:r>
     </w:p>
     <w:p>
@@ -1159,7 +1159,7 @@
           <w:i w:val="0"/>
           <w:sz w:val="28"/>
         </w:rPr>
-        <w:t>8. A constrição não se torna ilegítima apenas porque recai sobre bem utilizado pelo devedor em sua rotina, e o agravo não indica a atividade profissional exercida nem documento que comprove ser o veículo indispensável.</w:t>
+        <w:t>8. A decisão que deferiu a penhora determinou o depósito do veículo em mãos do executado, e a alegação de uso pessoal e profissional veio sem indicação da atividade exercida nem documento que comprove a indispensabilidade do bem.</w:t>
       </w:r>
     </w:p>
     <w:p>
@@ -1757,6 +1757,42 @@
         <w:ind w:firstLine="2268"/>
         <w:jc w:val="both"/>
       </w:pPr>
+      <w:commentRangeStart w:id="9"/>
+      <w:r>
+        <w:rPr>
+          <w:rFonts w:ascii="Arial" w:hAnsi="Arial" w:cs="Arial"/>
+          <w:b w:val="0"/>
+          <w:i w:val="0"/>
+          <w:sz w:val="28"/>
+        </w:rPr>
+        <w:t>Após a liminar, o oficial de justiça certificou que não localizou o veículo, que teria sido vendido segundo a genitora do executado (ID 285736371, origem). O executado Ricardo, intimado, informou que o bem não foi alienado e está à disposição da Justiça (ID 290817285, origem).</w:t>
+      </w:r>
+      <w:commentRangeEnd w:id="9"/>
+      <w:r>
+        <w:rPr>
+          <w:rStyle w:val="CommentReference"/>
+        </w:rPr>
+        <w:commentReference w:id="9"/>
+      </w:r>
+    </w:p>
+    <w:p>
+      <w:pPr>
+        <w:spacing w:line="360" w:lineRule="auto" w:before="0" w:after="0"/>
+        <w:ind w:firstLine="2268"/>
+        <w:jc w:val="both"/>
+      </w:pPr>
+      <w:r>
+        <w:rPr>
+          <w:sz w:val="28"/>
+        </w:rPr>
+      </w:r>
+    </w:p>
+    <w:p>
+      <w:pPr>
+        <w:spacing w:line="360" w:lineRule="auto" w:before="0" w:after="0"/>
+        <w:ind w:firstLine="2268"/>
+        <w:jc w:val="both"/>
+      </w:pPr>
       <w:r>
         <w:rPr>
           <w:rFonts w:ascii="Arial" w:hAnsi="Arial" w:cs="Arial"/>
@@ -2329,16 +2365,42 @@
         <w:ind w:firstLine="2268"/>
         <w:jc w:val="both"/>
       </w:pPr>
-      <w:commentRangeStart w:id="9"/>
-      <w:r>
-        <w:rPr>
-          <w:rFonts w:ascii="Arial" w:hAnsi="Arial" w:cs="Arial"/>
-          <w:b w:val="0"/>
-          <w:i w:val="0"/>
-          <w:sz w:val="28"/>
-        </w:rPr>
-        <w:t xml:space="preserve">Quanto ao decurso de tempo, o próprio agravo informa que o pedido de reiteração da pesquisa SISBAJUD formulado pela credora foi indeferido em 26/11/2025 e que a penhora do veículo foi deferida em 23/03/2026, </w:t>
-      </w:r>
+      <w:commentRangeStart w:id="10"/>
+      <w:r>
+        <w:rPr>
+          <w:rFonts w:ascii="Arial" w:hAnsi="Arial" w:cs="Arial"/>
+          <w:b w:val="0"/>
+          <w:i w:val="0"/>
+          <w:sz w:val="28"/>
+        </w:rPr>
+        <w:t>Quanto ao decurso de tempo, a última pesquisa pelo SISBAJUD foi certificada em 01/02/2023 (ID 148239316, origem). A reiteração pedida pela credora foi indeferida em 26/11/2025, em decisão que não é objeto deste agravo (ID 257982500, origem).</w:t>
+      </w:r>
+      <w:commentRangeEnd w:id="10"/>
+      <w:r>
+        <w:rPr>
+          <w:rStyle w:val="CommentReference"/>
+        </w:rPr>
+        <w:commentReference w:id="10"/>
+      </w:r>
+    </w:p>
+    <w:p>
+      <w:pPr>
+        <w:spacing w:line="360" w:lineRule="auto" w:before="0" w:after="0"/>
+        <w:ind w:firstLine="2268"/>
+        <w:jc w:val="both"/>
+      </w:pPr>
+      <w:r>
+        <w:rPr>
+          <w:sz w:val="28"/>
+        </w:rPr>
+      </w:r>
+    </w:p>
+    <w:p>
+      <w:pPr>
+        <w:spacing w:line="360" w:lineRule="auto" w:before="0" w:after="0"/>
+        <w:ind w:firstLine="2268"/>
+        <w:jc w:val="both"/>
+      </w:pPr>
       <w:r>
         <w:rPr>
           <w:rFonts w:ascii="Arial" w:hAnsi="Arial" w:cs="Arial"/>
@@ -2347,14 +2409,7 @@
           <w:sz w:val="28"/>
           <w:highlight w:val="yellow"/>
         </w:rPr>
-        <w:t>menos de quatro meses depois, sem que os agravantes apontem elemento concreto de alteração patrimonial nesse período (ID 86833446).</w:t>
-      </w:r>
-      <w:commentRangeEnd w:id="9"/>
-      <w:r>
-        <w:rPr>
-          <w:rStyle w:val="CommentReference"/>
-        </w:rPr>
-        <w:commentReference w:id="9"/>
+        <w:t>Assim, a renovação da pesquisa depende de pedido da exequente e não é condição para a penhora do veículo, pois a ordem legal pode ser alterada conforme as circunstâncias do caso (CPC 835 § 1º).</w:t>
       </w:r>
     </w:p>
     <w:p>
@@ -2572,22 +2627,50 @@
         <w:ind w:firstLine="2268"/>
         <w:jc w:val="both"/>
       </w:pPr>
-      <w:commentRangeStart w:id="10"/>
-      <w:r>
-        <w:rPr>
-          <w:rFonts w:ascii="Arial" w:hAnsi="Arial" w:cs="Arial"/>
-          <w:b w:val="0"/>
-          <w:i w:val="0"/>
-          <w:sz w:val="28"/>
-        </w:rPr>
-        <w:t>No caso, o único meio indicado pelos agravantes é a nova pesquisa pelo SISBAJUD, sem garantia de êxito, e o agravo não informa a atividade profissional exercida nem aponta documento que comprove ser o veículo indispensável ao seu exercício (ID 86833446).</w:t>
-      </w:r>
-      <w:commentRangeEnd w:id="10"/>
+      <w:r>
+        <w:rPr>
+          <w:rFonts w:ascii="Arial" w:hAnsi="Arial" w:cs="Arial"/>
+          <w:b w:val="0"/>
+          <w:i w:val="0"/>
+          <w:sz w:val="28"/>
+        </w:rPr>
+        <w:t>No caso, o único meio indicado pelos agravantes é a nova pesquisa pelo SISBAJUD, sem garantia de êxito.</w:t>
+      </w:r>
+    </w:p>
+    <w:p>
+      <w:pPr>
+        <w:spacing w:line="360" w:lineRule="auto" w:before="0" w:after="0"/>
+        <w:ind w:firstLine="2268"/>
+        <w:jc w:val="both"/>
+      </w:pPr>
+      <w:r>
+        <w:rPr>
+          <w:sz w:val="28"/>
+        </w:rPr>
+      </w:r>
+    </w:p>
+    <w:p>
+      <w:pPr>
+        <w:spacing w:line="360" w:lineRule="auto" w:before="0" w:after="0"/>
+        <w:ind w:firstLine="2268"/>
+        <w:jc w:val="both"/>
+      </w:pPr>
+      <w:commentRangeStart w:id="11"/>
+      <w:r>
+        <w:rPr>
+          <w:rFonts w:ascii="Arial" w:hAnsi="Arial" w:cs="Arial"/>
+          <w:b w:val="0"/>
+          <w:i w:val="0"/>
+          <w:sz w:val="28"/>
+        </w:rPr>
+        <w:t>A decisão que deferiu a penhora determinou o depósito do veículo em mãos do executado (ID 269485437, origem). A petição de chamamento do feito à ordem alega o uso pessoal e profissional do bem sem indicar a atividade exercida nem juntar documento (ID 273823469, origem).</w:t>
+      </w:r>
+      <w:commentRangeEnd w:id="11"/>
       <w:r>
         <w:rPr>
           <w:rStyle w:val="CommentReference"/>
         </w:rPr>
-        <w:commentReference w:id="10"/>
+        <w:commentReference w:id="11"/>
       </w:r>
     </w:p>
     <w:p>
@@ -3094,7 +3177,7 @@
         <w:spacing w:line="360" w:lineRule="auto" w:before="0" w:after="0"/>
         <w:jc w:val="center"/>
       </w:pPr>
-      <w:commentRangeStart w:id="11"/>
+      <w:commentRangeStart w:id="12"/>
       <w:r>
         <w:rPr>
           <w:rFonts w:ascii="Arial" w:hAnsi="Arial" w:cs="Arial"/>
@@ -3105,12 +3188,12 @@
         </w:rPr>
         <w:t>PRECEDENTES CONTRÁRIOS AO VOTO</w:t>
       </w:r>
-      <w:commentRangeEnd w:id="11"/>
+      <w:commentRangeEnd w:id="12"/>
       <w:r>
         <w:rPr>
           <w:rStyle w:val="CommentReference"/>
         </w:rPr>
-        <w:commentReference w:id="11"/>
+        <w:commentReference w:id="12"/>
       </w:r>
     </w:p>
     <w:p>
@@ -3345,7 +3428,7 @@
       </w:r>
     </w:p>
   </w:comment>
-  <w:comment w:id="8" w:author="Minuta GDSXSR" w:initials="MG" w:date="2026-10-29T18:31:47Z">
+  <w:comment w:id="8" w:author="Minuta GDSXSR" w:initials="MG" w:date="2026-10-30T20:55:06Z">
     <w:p>
       <w:pPr>
         <w:pStyle w:val="CommentText"/>
@@ -3361,7 +3444,7 @@
       </w:r>
     </w:p>
   </w:comment>
-  <w:comment w:id="9" w:author="Minuta GDSXSR" w:initials="MG" w:date="2026-10-29T18:31:47Z">
+  <w:comment w:id="9" w:author="Minuta GDSXSR" w:initials="MG" w:date="2026-10-30T20:55:06Z">
     <w:p>
       <w:pPr>
         <w:pStyle w:val="CommentText"/>
@@ -3373,11 +3456,11 @@
         <w:annotationRef/>
       </w:r>
       <w:r>
-        <w:t>MINUTA GDSXSR — PENDÊNCIA (C-52): as datas de 26/11/2025 e 23/03/2026 vêm do próprio agravo (ID 86833446, págs. 5 e 7); a decisão que indeferiu a reiteração não veio nos autos recebidos e o agravo cita a última pesquisa SISBAJUD só por "ID 249067" (incompleto). Conferir no processo de origem (0720826-02.2021.8.07.0001) a data da última pesquisa SISBAJUD e a decisão de 26/11/2025. Se a última pesquisa tiver mais de um ano na data da penhora, a premissa deste parágrafo e o item 6 da ementa mudam (linha da Turma: renovação após cerca de um ano, perfil AGI 5.1).</w:t>
+        <w:t>MINUTA GDSXSR — Fatos posteriores à liminar, conferidos nos autos de origem (certidão do oficial de justiça de 04/08/2026 e petição do executado de 15/09/2026). O voto não os usa como fundamento: o veículo segue penhorado (restrição RENAJUD, ID 272139536, origem) e a localização ainda será esclarecida na origem.</w:t>
       </w:r>
     </w:p>
   </w:comment>
-  <w:comment w:id="10" w:author="Minuta GDSXSR" w:initials="MG" w:date="2026-10-29T18:31:47Z">
+  <w:comment w:id="10" w:author="Minuta GDSXSR" w:initials="MG" w:date="2026-10-30T20:55:06Z">
     <w:p>
       <w:pPr>
         <w:pStyle w:val="CommentText"/>
@@ -3389,11 +3472,11 @@
         <w:annotationRef/>
       </w:r>
       <w:r>
-        <w:t>MINUTA GDSXSR — PENDÊNCIA (C-52): afirmação limitada ao que consta do agravo (ID 86833446), que não traz anexos além da decisão agravada. Conferir na petição de chamamento do feito à ordem (ID 273823469, origem) se os executados indicaram a atividade profissional ou juntaram documento sobre o uso do veículo; se juntaram, o parágrafo é ajustado.</w:t>
+        <w:t>MINUTA GDSXSR — ATENÇÃO, RESULTADO (C-53): conferi nos autos de origem que a última pesquisa SISBAJUD é de 01/02/2023 (mais de três anos antes da penhora, de 23/03/2026), e não de data recente como o agravo sugere. A linha da Turma admite renovar a pesquisa depois de cerca de um ano, sem prova de alteração patrimonial (perfil AGI 5.1; AGI 0732477-92 e 0726981-82, Des. Sérgio Rocha, Quarta Turma, out/2025, ambos DP em agravo do exequente). Mantive o NP porque: (i) a liminar já indeferiu o efeito suspensivo; (ii) quem pediu a reiteração foi a credora, em 2025, e o pedido foi indeferido em decisão estranha a este agravo; (iii) a decisão que deferiu a penhora mandou depositar o veículo em mãos do executado (ID 269485437, origem), o que afasta a perda do uso e da renda alegada; (iv) o chamamento do feito à ordem não indicou a atividade nem juntou prova do uso profissional (ID 273823469, origem). O voto não diz que a renovação é descabida: apenas que não é condição da penhora. Se o Desembargador preferir DPP (nova pesquisa SISBAJUD antes da avaliação do veículo), o resultado muda e eu refaço o capítulo.</w:t>
       </w:r>
     </w:p>
   </w:comment>
-  <w:comment w:id="11" w:author="Minuta GDSXSR" w:initials="MG" w:date="2026-10-29T18:31:47Z">
+  <w:comment w:id="11" w:author="Minuta GDSXSR" w:initials="MG" w:date="2026-10-30T20:55:06Z">
     <w:p>
       <w:pPr>
         <w:pStyle w:val="CommentText"/>
@@ -3405,7 +3488,23 @@
         <w:annotationRef/>
       </w:r>
       <w:r>
-        <w:t>MINUTA GDSXSR — Jurisprudência invocada pelo agravo em sentido favorável à renovação da pesquisa SISBAJUD, colocada ao final em violeta (C-46, C-53), sem parágrafo de distinção no voto e fora de "Jurisprudência relevante citada". Ementa conferida no iajus (STJ, AREsp 3121146, Terceira Turma, Min. Moura Ribeiro, julgado em 01/06/2026). PENDÊNCIA (C-52): o iajus devolveu só a ementa (inteiro teor indisponível) e não informa a data de publicação nem a UF de origem; o DJEN de 09/06/2026 e o "DF" constam apenas da transcrição feita no agravo, e o portal do STJ (SCON) recusou o acesso automático. Conferir no SCON antes da sessão. O acórdão trata de quase cinco anos entre a última pesquisa e o novo requerimento, intervalo que o voto não confirma neste caso (ver pendência da data da última pesquisa).</w:t>
+        <w:t>MINUTA GDSXSR — Conferido na origem: a decisão de ID 269485437 diz "devendo o(s) bem(ns) ser(em) depositado(s) em mãos do executado"; a petição de ID 273823469 afirma que o veículo é "bem de uso pessoal e profissional" sem indicar a atividade nem anexar documento; o agravo (ID 86833446) tampouco anexa prova.</w:t>
+      </w:r>
+    </w:p>
+  </w:comment>
+  <w:comment w:id="12" w:author="Minuta GDSXSR" w:initials="MG" w:date="2026-10-30T20:55:06Z">
+    <w:p>
+      <w:pPr>
+        <w:pStyle w:val="CommentText"/>
+      </w:pPr>
+      <w:r>
+        <w:rPr>
+          <w:rStyle w:val="CommentReference"/>
+        </w:rPr>
+        <w:annotationRef/>
+      </w:r>
+      <w:r>
+        <w:t>MINUTA GDSXSR — Jurisprudência invocada pelo agravo em sentido favorável à renovação da pesquisa SISBAJUD, colocada ao final em violeta (C-46, C-53), sem parágrafo de distinção no voto e fora de "Jurisprudência relevante citada". Ementa conferida no iajus (STJ, AREsp 3121146, Terceira Turma, Min. Moura Ribeiro, julgado em 01/06/2026). PENDÊNCIA (C-52): o iajus devolveu só a ementa (inteiro teor indisponível) e não informa a data de publicação nem a UF de origem; o DJEN de 09/06/2026 e o "DF" constam apenas da transcrição feita no agravo, e o portal do STJ (SCON) recusou o acesso automático. Conferir no SCON antes da sessão. O acórdão trata de quase cinco anos entre a última pesquisa e o novo requerimento; neste caso o intervalo é de mais de três anos (01/02/2023 a 23/03/2026), o que aproxima a hipótese (ver comentário de resultado).</w:t>
       </w:r>
     </w:p>
   </w:comment>

</xml_diff>